<commit_message>
Fuera el tamano del grupo (maximo 16) de volante del decidido, hoja y propuesta para fondos y presentacion: no ayuda frente a academias de grupos chicos
Co-Authored-By: Claude Fable 5.1 <noreply@anthropic.com>
</commit_message>
<xml_diff>
--- a/recursos/comercial/B2B/HOJA_FONDOS_EMPLEADOS_HEIIU.docx
+++ b/recursos/comercial/B2B/HOJA_FONDOS_EMPLEADOS_HEIIU.docx
@@ -128,7 +128,7 @@
           <w:b w:val="0"/>
           <w:sz w:val="19"/>
         </w:rPr>
-        <w:t>, en grupos de máximo 16. B2 es el nivel que piden las vacantes, las universidades y los programas en el exterior. Convenios vigentes con entidades y empresas de la región, con becas a nombre de cada una.</w:t>
+        <w:t>. B2 es el nivel que piden las vacantes, las universidades y los programas en el exterior. Convenios vigentes con entidades y empresas de la región, con becas a nombre de cada una.</w:t>
       </w:r>
     </w:p>
     <w:p>
@@ -285,7 +285,7 @@
                 <w:b w:val="0"/>
                 <w:sz w:val="17"/>
               </w:rPr>
-              <w:t>Profesores bilingües colombianos, uno por grupo de máximo 16. Trabajan como coach: dirigen la simulación, corrigen en el momento y revisan el video de cada día. Coordinación académica sigue asistencia, tareas y evaluaciones.</w:t>
+              <w:t>Profesores bilingües colombianos que trabajan como coach: dirigen la simulación, corrigen en el momento y revisan el video de cada día. Coordinación académica sigue asistencia, tareas y evaluaciones.</w:t>
             </w:r>
           </w:p>
         </w:tc>

</xml_diff>

<commit_message>
Garantia: 'si cumples y no avanzas EN INGLES' en todas las piezas, hoja, propuesta y presentacion (el proyecto y la meta no se garantizan); calle D recortada para que quepa
Co-Authored-By: Claude Fable 5.1 <noreply@anthropic.com>
</commit_message>
<xml_diff>
--- a/recursos/comercial/B2B/HOJA_FONDOS_EMPLEADOS_HEIIU.docx
+++ b/recursos/comercial/B2B/HOJA_FONDOS_EMPLEADOS_HEIIU.docx
@@ -420,7 +420,7 @@
                 <w:b/>
                 <w:sz w:val="17"/>
               </w:rPr>
-              <w:t>Si el estudiante cumple su parte (asistencia del 80%, 90% de las tareas con video diario, todas las evaluaciones) y no avanza, le devolvemos el 100% del nivel.</w:t>
+              <w:t>Si el estudiante cumple su parte (asistencia del 80%, 90% de las tareas con video diario, todas las evaluaciones) y no avanza en inglés, le devolvemos el 100% del nivel.</w:t>
             </w:r>
             <w:r>
               <w:rPr>
@@ -1023,7 +1023,7 @@
           <w:b w:val="0"/>
           <w:sz w:val="19"/>
         </w:rPr>
-        <w:t xml:space="preserve"> si cumple su parte y no avanza, recibe el 100% del nivel de vuelta.</w:t>
+        <w:t xml:space="preserve"> si cumple su parte y no avanza en inglés, recibe el 100% del nivel de vuelta.</w:t>
       </w:r>
     </w:p>
     <w:p>

</xml_diff>